<commit_message>
FINAL DEEP AUDIT PASS READY FOR PRINT: fix chapter numbering 1-16 Junqueira alignment, transitions, remove editorial scope leakage, improve CORE IDEA pedagogy, deduplicate QB 935Q 0 duplicates, fix placeholder explanations, regenerate DOCX, 12 gates PASS
Co-authored-by: arena-agent <297053741+arena-agent@users.noreply.github.com>
</commit_message>
<xml_diff>
--- a/Book1_Essential_Histology/Essential_Histology_Textbook.docx
+++ b/Book1_Essential_Histology/Essential_Histology_Textbook.docx
@@ -83,12 +83,12 @@
     </w:p>
     <w:p>
       <w:r>
-        <w:t>**Primary Reference:** Junqueira's Basic Histology: Text and Atlas — 17th Edition, by Anthony L. Mescher, McGraw Hill</w:t>
-      </w:r>
-    </w:p>
-    <w:p>
-      <w:r>
-        <w:t>**Official Syllabus (Specialty Examination):** Based on Junqueira 17th Chapters 1,2,3,4,5,6,9,11,12,13,14,15,16,17,18,20 — total 16 chapters. All study materials based primarily on this edition and remain within official syllabus. Chapters not included not incorporated into core study plan unless specifically required.</w:t>
+        <w:t>**Primary Reference:** Junqueira's Basic Histology: Text and Atlas — 17th Edition, by Anthony L. Mescher, McGraw Hill — primary and authoritative reference for Histology section of Specialty Examination</w:t>
+      </w:r>
+    </w:p>
+    <w:p>
+      <w:r>
+        <w:t>**Official Syllabus (Specialty Examination):** Based on Junqueira 17th Chapters 1,2,3,4,5,6,9,11,12,13,14,15,16,17,18,20 — total 16 chapters. All study materials based primarily on this edition and remain within official syllabus.</w:t>
       </w:r>
     </w:p>
     <w:p>
@@ -116,7 +116,7 @@
     </w:p>
     <w:p>
       <w:r>
-        <w:t>The book is aligned with **Junqueira's Basic Histology, 17th Edition** as primary and authoritative reference, and organized for the Afghanistan 1405 Clinical Medicine postgraduate examination official syllabus (16 chapters). It is not a compressed copy of Junqueira. It is a learning system that makes required histology understandable, memorable, connected, and teachable.</w:t>
+        <w:t>The book is aligned with Junqueira's Basic Histology, 17th Edition as primary and authoritative reference, and organized for the Afghanistan 1405 Clinical Medicine postgraduate examination official syllabus (16 chapters). It is not a compressed copy of Junqueira. It is a learning system that makes required histology understandable, memorable, connected, and teachable.</w:t>
       </w:r>
     </w:p>
     <w:p>
@@ -159,12 +159,12 @@
     </w:p>
     <w:p>
       <w:r>
-        <w:t>**Before exam — consolidate:** Use High-Yield, Integrated Summary, Rapid Review. Test yourself with Mastery Check prompts (open-ended, not MCQs).</w:t>
-      </w:r>
-    </w:p>
-    <w:p>
-      <w:r>
-        <w:t>Question Bank is separate: **Essential Histology: Question Bank** — questions traceable to learning objectives, based on official 16-chapter syllabus.</w:t>
+        <w:t>**Before exam — consolidate:** Use High-Yield, Integrated Summary, Rapid Review. Test yourself with Mastery Check questions (open-ended, not MCQs).</w:t>
+      </w:r>
+    </w:p>
+    <w:p>
+      <w:r>
+        <w:t>Question Bank is separate: Essential Histology: Question Bank — questions traceable to learning objectives, based on official 16-chapter syllabus.</w:t>
       </w:r>
     </w:p>
     <w:p>
@@ -233,7 +233,7 @@
         <w:pStyle w:val="ListNumber"/>
       </w:pPr>
       <w:r>
-        <w:t>7. Chapter 9 — Nerve Tissue &amp; the Nervous System (Junqueira Ch9)</w:t>
+        <w:t>7. Chapter 7 — Nerve Tissue &amp; the Nervous System (Junqueira Ch9)</w:t>
       </w:r>
     </w:p>
     <w:p>
@@ -241,7 +241,7 @@
         <w:pStyle w:val="ListNumber"/>
       </w:pPr>
       <w:r>
-        <w:t>8. Chapter 11 — The Circulatory System (Junqueira Ch11)</w:t>
+        <w:t>8. Chapter 8 — The Circulatory System (Junqueira Ch11)</w:t>
       </w:r>
     </w:p>
     <w:p>
@@ -249,7 +249,7 @@
         <w:pStyle w:val="ListNumber"/>
       </w:pPr>
       <w:r>
-        <w:t>9. Chapter 12 — Blood (Junqueira Ch12)</w:t>
+        <w:t>9. Chapter 9 — Blood (Junqueira Ch12)</w:t>
       </w:r>
     </w:p>
     <w:p>
@@ -257,7 +257,7 @@
         <w:pStyle w:val="ListNumber"/>
       </w:pPr>
       <w:r>
-        <w:t>10. Chapter 13 — Hemopoiesis (Junqueira Ch13)</w:t>
+        <w:t>10. Chapter 10 — Hemopoiesis (Junqueira Ch13)</w:t>
       </w:r>
     </w:p>
     <w:p>
@@ -265,7 +265,7 @@
         <w:pStyle w:val="ListNumber"/>
       </w:pPr>
       <w:r>
-        <w:t>11. Chapter 14 — The Immune System &amp; Lymphoid Organs (Junqueira Ch14)</w:t>
+        <w:t>11. Chapter 11 — The Immune System &amp; Lymphoid Organs (Junqueira Ch14)</w:t>
       </w:r>
     </w:p>
     <w:p>
@@ -273,7 +273,7 @@
         <w:pStyle w:val="ListNumber"/>
       </w:pPr>
       <w:r>
-        <w:t>12. Chapter 15 — Digestive Tract (Junqueira Ch15)</w:t>
+        <w:t>12. Chapter 12 — Digestive Tract (Junqueira Ch15)</w:t>
       </w:r>
     </w:p>
     <w:p>
@@ -281,7 +281,7 @@
         <w:pStyle w:val="ListNumber"/>
       </w:pPr>
       <w:r>
-        <w:t>13. Chapter 16 — Organs Associated with the Digestive Tract (Junqueira Ch16)</w:t>
+        <w:t>13. Chapter 13 — Organs Associated with the Digestive Tract (Junqueira Ch16)</w:t>
       </w:r>
     </w:p>
     <w:p>
@@ -289,7 +289,7 @@
         <w:pStyle w:val="ListNumber"/>
       </w:pPr>
       <w:r>
-        <w:t>14. Chapter 17 — The Respiratory System (Junqueira Ch17)</w:t>
+        <w:t>14. Chapter 14 — The Respiratory System (Junqueira Ch17)</w:t>
       </w:r>
     </w:p>
     <w:p>
@@ -297,7 +297,7 @@
         <w:pStyle w:val="ListNumber"/>
       </w:pPr>
       <w:r>
-        <w:t>15. Chapter 18 — Skin (Junqueira Ch18)</w:t>
+        <w:t>15. Chapter 15 — Skin (Junqueira Ch18)</w:t>
       </w:r>
     </w:p>
     <w:p>
@@ -305,12 +305,7 @@
         <w:pStyle w:val="ListNumber"/>
       </w:pPr>
       <w:r>
-        <w:t>16. Chapter 20 — Endocrine Glands (Junqueira Ch20)</w:t>
-      </w:r>
-    </w:p>
-    <w:p>
-      <w:r>
-        <w:t>Chapters not in official syllabus (Cartilage Ch7, Bone Ch8, Muscle Tissue Ch10, Urinary System Ch19, Male Reproductive Ch21, Female Reproductive Ch22, Eye &amp; Ear Ch23) not incorporated into core study plan.</w:t>
+        <w:t>16. Chapter 16 — Endocrine Glands (Junqueira Ch20)</w:t>
       </w:r>
     </w:p>
     <w:p>
@@ -324,6 +319,11 @@
       </w:pPr>
       <w:r>
         <w:t>Chapter 1 — Histology &amp; Its Methods of Study</w:t>
+      </w:r>
+    </w:p>
+    <w:p>
+      <w:r>
+        <w:t>Junqueira 17th Edition — Chapter 1</w:t>
       </w:r>
     </w:p>
     <w:p>
@@ -479,7 +479,7 @@
           <w:b/>
           <w:i/>
         </w:rPr>
-        <w:t>**CORE IDEA:** Contrast is not decoration. It is chemistry made visible.</w:t>
+        <w:t>**CORE IDEA:** Contrast is not decoration. It is chemistry made visible — each stain and microscope reveals a specific chemical or physical property.</w:t>
       </w:r>
     </w:p>
     <w:p>
@@ -1590,7 +1590,7 @@
     </w:p>
     <w:p>
       <w:r>
-        <w:t>You have now seen how tissue is prepared and stained. Next, step inside the cell itself — the machinery that every stain in this chapter is lighting up: cytoplasm and cytoskeleton.</w:t>
+        <w:t>You have now seen how tissue is prepared and stained. Next, step inside the cell itself — the machinery that every stain in this chapter is lighting up: the cytoplasm.</w:t>
       </w:r>
     </w:p>
     <w:p>
@@ -1651,7 +1651,12 @@
         <w:pStyle w:val="Heading1"/>
       </w:pPr>
       <w:r>
-        <w:t>Chapter 2 — The Cytoplasm &amp; Cytoskeleton</w:t>
+        <w:t>Chapter 2 — The Cytoplasm</w:t>
+      </w:r>
+    </w:p>
+    <w:p>
+      <w:r>
+        <w:t>Junqueira 17th Edition — Chapter 2</w:t>
       </w:r>
     </w:p>
     <w:p>
@@ -1765,7 +1770,7 @@
           <w:b/>
           <w:i/>
         </w:rPr>
-        <w:t>**CORE IDEA:** RER makes proteins for export and membrane; SER makes lipid and detoxifies; Golgi modifies and sorts; lysosome digests; peroxisome oxidizes; mitochondria makes ATP; cytoskeleton organizes.</w:t>
+        <w:t>**CORE IDEA:** The cytoplasm organizes work by compartment: RER synthesizes proteins for export, SER synthesizes lipids and handles detoxification and calcium, Golgi modifies and sorts, lysosomes digest, peroxisomes oxidize, mitochondria produce ATP, and the cytoskeleton organizes space and transport.</w:t>
       </w:r>
     </w:p>
     <w:p>
@@ -2658,7 +2663,7 @@
     </w:p>
     <w:p>
       <w:r>
-        <w:t>Cytoplasm builds. Nucleus controls what is built, when, and how much. Next, how 2 meters of DNA fits in a 6 µm nucleus and remains readable.</w:t>
+        <w:t>The cytoplasm builds and moves. The nucleus controls what is built, when, and how much. Next, how two meters of DNA fits in a six micrometer nucleus and remains readable.</w:t>
       </w:r>
     </w:p>
     <w:p>
@@ -2720,6 +2725,11 @@
       </w:pPr>
       <w:r>
         <w:t>Chapter 3 — The Nucleus</w:t>
+      </w:r>
+    </w:p>
+    <w:p>
+      <w:r>
+        <w:t>Junqueira 17th Edition — Chapter 3</w:t>
       </w:r>
     </w:p>
     <w:p>
@@ -2828,7 +2838,7 @@
           <w:b/>
           <w:i/>
         </w:rPr>
-        <w:t>**CORE IDEA:** Light nucleus = active, dark nucleus = inactive. Nucleolus prominence = ribosome demand.</w:t>
+        <w:t>**CORE IDEA:** A pale, euchromatic nucleus with a prominent nucleolus indicates active transcription and ribosome production, while a dark, heterochromatic nucleus indicates quiescence.</w:t>
       </w:r>
     </w:p>
     <w:p>
@@ -3377,7 +3387,7 @@
     </w:p>
     <w:p>
       <w:r>
-        <w:t>Cells with controlled genomes organize into tissues. Next, how polarized cells form sheets that seal, absorb, and secrete: epithelium.</w:t>
+        <w:t>Cells with controlled genomes organize into tissues. Next, how polarized cells form sheets that seal, absorb, and secrete: epithelial tissue.</w:t>
       </w:r>
     </w:p>
     <w:p>
@@ -3431,6 +3441,11 @@
       </w:pPr>
       <w:r>
         <w:t>Chapter 4 — Epithelial Tissue</w:t>
+      </w:r>
+    </w:p>
+    <w:p>
+      <w:r>
+        <w:t>Junqueira 17th Edition — Chapter 4</w:t>
       </w:r>
     </w:p>
     <w:p>
@@ -3555,7 +3570,7 @@
           <w:b/>
           <w:i/>
         </w:rPr>
-        <w:t>**CORE IDEA:** Apical solves lumen problems, lateral solves neighbor problems, basal solves matrix problems.</w:t>
+        <w:t>**CORE IDEA:** Epithelial polarity solves three different problems: the apical surface handles the lumen, the lateral surface handles neighboring cells, and the basal surface handles attachment to the basement membrane.</w:t>
       </w:r>
     </w:p>
     <w:p>
@@ -4623,7 +4638,7 @@
     </w:p>
     <w:p>
       <w:r>
-        <w:t>Epithelium is boundary. Next, framework that supports, connects, defends: connective tissue.</w:t>
+        <w:t>Epithelium is the boundary tissue. Next, the framework that supports, connects, and defends: connective tissue.</w:t>
       </w:r>
     </w:p>
     <w:p>
@@ -4704,6 +4719,11 @@
       </w:r>
     </w:p>
     <w:p>
+      <w:r>
+        <w:t>Junqueira 17th Edition — Chapter 5</w:t>
+      </w:r>
+    </w:p>
+    <w:p>
       <w:pPr>
         <w:pStyle w:val="Heading3"/>
       </w:pPr>
@@ -4821,7 +4841,7 @@
     </w:p>
     <w:p>
       <w:r>
-        <w:t>**Fiber type = disease type, ground substance = water, fibroblast writes scar.**</w:t>
+        <w:t>**The molecular composition of the extracellular matrix determines mechanical properties, tissue distribution, and disease vulnerability.**</w:t>
       </w:r>
     </w:p>
     <w:p>
@@ -4830,7 +4850,7 @@
           <w:b/>
           <w:i/>
         </w:rPr>
-        <w:t>**CORE IDEA:** Collagen resists tension, elastic recoils, GAGs hold water for compression resistance.</w:t>
+        <w:t>**CORE IDEA:** In connective tissue, collagen fibers resist tension, elastic fibers provide recoil, and glycosaminoglycans hold water to resist compression.</w:t>
       </w:r>
     </w:p>
     <w:p>
@@ -4880,7 +4900,7 @@
         <w:pStyle w:val="ListBullet"/>
       </w:pPr>
       <w:r>
-        <w:t>- Type II: fibrillar thin, hyaline cartilage matrix, vitreous, nucleus pulposus — noted here for completeness but detailed cartilage histology is out of scope per official syllabus (Junqueira Ch7).</w:t>
+        <w:t>- Type II: fibrillar thin, hyaline cartilage matrix, vitreous, nucleus pulposus.</w:t>
       </w:r>
     </w:p>
     <w:p>
@@ -5024,11 +5044,6 @@
       </w:pPr>
       <w:r>
         <w:t>- Mucoid: Wharton jelly umbilical cord hyaluronan-rich.</w:t>
-      </w:r>
-    </w:p>
-    <w:p>
-      <w:r>
-        <w:t>**Note on cartilage and bone:** Cartilage (Junqueira Ch7) and bone (Ch8) are specialized connective tissues with type II collagen and calcified type I collagen respectively. Detailed histology of hyaline, elastic, fibrocartilage, woven vs lamellar bone, osteon, osteoblast/osteocyte/osteoclast, endochondral vs intramembranous ossification is out of scope per official 16-chapter syllabus and therefore not included in core study plan. Ground substance GAGs hold water for cartilage compression resistance, and bone adds hydroxyapatite mineral for rigidity — concepts mentioned here for continuity.</w:t>
       </w:r>
     </w:p>
     <w:p>
@@ -5606,11 +5621,6 @@
       </w:r>
     </w:p>
     <w:p>
-      <w:r>
-        <w:t>Connective tissue cells+fibers+ground substance. Fibers collagen I-IV master (I tensile bone/skin, III reticular/wound, IV sheet BM), elastic elastin+fibrillin recoil, reticular III silver stroma. Ground substance GAGs hydrated compression resistance. Cells fibroblast builds macrophage defends mast metachromatic allergy plasma antibody. Adult types loose, dense regular parallel, dense irregular interwoven, elastic, reticular silver, mucoid. Cartilage and bone are specialized connective tissues out of scope per official syllabus (Junqueira Ch7-8).</w:t>
-      </w:r>
-    </w:p>
-    <w:p>
       <w:pPr>
         <w:pStyle w:val="Heading3"/>
       </w:pPr>
@@ -5668,7 +5678,7 @@
     </w:p>
     <w:p>
       <w:r>
-        <w:t>Framework built. Specialized framework that stores energy and signals: adipose tissue.</w:t>
+        <w:t>The framework is built. Next, a specialized framework that stores energy and signals: adipose tissue.</w:t>
       </w:r>
     </w:p>
     <w:p>
@@ -5720,14 +5730,6 @@
       </w:r>
     </w:p>
     <w:p>
-      <w:pPr>
-        <w:pStyle w:val="ListBullet"/>
-      </w:pPr>
-      <w:r>
-        <w:t>- Cartilage/bone specialized CT out of scope per official syllabus (Junqueira Ch7-8) — not in core study plan.</w:t>
-      </w:r>
-    </w:p>
-    <w:p>
       <w:r>
         <w:t>---</w:t>
       </w:r>
@@ -5738,6 +5740,11 @@
       </w:pPr>
       <w:r>
         <w:t>Chapter 6 — Adipose Tissue</w:t>
+      </w:r>
+    </w:p>
+    <w:p>
+      <w:r>
+        <w:t>Junqueira 17th Edition — Chapter 6</w:t>
       </w:r>
     </w:p>
     <w:p>
@@ -5838,7 +5845,7 @@
           <w:b/>
           <w:i/>
         </w:rPr>
-        <w:t>**CORE IDEA:** White signet-ring storage + leptin, brown multilocular + mitochondria + UCP1 heat.</w:t>
+        <w:t>**CORE IDEA:** White adipocytes store energy as a single large droplet and signal via leptin, while brown adipocytes generate heat via many small droplets, abundant mitochondria, and uncoupling protein 1.</w:t>
       </w:r>
     </w:p>
     <w:p>
@@ -6296,7 +6303,7 @@
     </w:p>
     <w:p>
       <w:r>
-        <w:t>Storage → contraction. Next tissue converts chemical energy to mechanical work: muscle.</w:t>
+        <w:t>Energy storage is organized. Next, tissue that lasts a lifetime and wires the body: nerve tissue and the nervous system.</w:t>
       </w:r>
     </w:p>
     <w:p>
@@ -6357,7 +6364,12 @@
         <w:pStyle w:val="Heading1"/>
       </w:pPr>
       <w:r>
-        <w:t>Chapter 8 — Nerve Tissue &amp; the Nervous System</w:t>
+        <w:t>Chapter 7 — Nerve Tissue &amp; the Nervous System</w:t>
+      </w:r>
+    </w:p>
+    <w:p>
+      <w:r>
+        <w:t>Junqueira 17th Edition — Chapter 9</w:t>
       </w:r>
     </w:p>
     <w:p>
@@ -6458,7 +6470,7 @@
           <w:b/>
           <w:i/>
         </w:rPr>
-        <w:t>**CORE IDEA:** Dendrites receive axon conducts myelin insulates nodes regenerate action potential glia support.</w:t>
+        <w:t>**CORE IDEA:** In nerve tissue, dendrites receive signals, the axon conducts them, myelin insulates to speed conduction, nodes of Ranvier regenerate the action potential, and glia provide support, myelination, and barrier functions.</w:t>
       </w:r>
     </w:p>
     <w:p>
@@ -7249,7 +7261,7 @@
     </w:p>
     <w:p>
       <w:r>
-        <w:t>Nerve needs supply and connection. Next system supplies and connects all tissues: circulatory.</w:t>
+        <w:t>Nerve needs supply and connection. Next, the system that supplies and connects all tissues: the circulatory system.</w:t>
       </w:r>
     </w:p>
     <w:p>
@@ -7302,7 +7314,12 @@
         <w:pStyle w:val="Heading1"/>
       </w:pPr>
       <w:r>
-        <w:t>Chapter 9 — The Circulatory System</w:t>
+        <w:t>Chapter 8 — The Circulatory System</w:t>
+      </w:r>
+    </w:p>
+    <w:p>
+      <w:r>
+        <w:t>Junqueira 17th Edition — Chapter 11</w:t>
       </w:r>
     </w:p>
     <w:p>
@@ -7403,7 +7420,7 @@
           <w:b/>
           <w:i/>
         </w:rPr>
-        <w:t>**CORE IDEA:** Elastic artery Windkessel recoil, muscular artery resistance, capillary exchange type determines permeability, vein capacitance + valves.</w:t>
+        <w:t>**CORE IDEA:** In the circulatory system, elastic arteries recoil to maintain flow, muscular arteries regulate resistance, capillary type determines permeability, and veins provide capacitance with valves ensuring unidirectional flow.</w:t>
       </w:r>
     </w:p>
     <w:p>
@@ -8266,7 +8283,7 @@
     </w:p>
     <w:p>
       <w:r>
-        <w:t>Circulatory carries specialized connective tissue: blood.</w:t>
+        <w:t>The circulatory system carries a specialized connective tissue: blood.</w:t>
       </w:r>
     </w:p>
     <w:p>
@@ -8319,7 +8336,12 @@
         <w:pStyle w:val="Heading1"/>
       </w:pPr>
       <w:r>
-        <w:t>Chapter 10 — Blood</w:t>
+        <w:t>Chapter 9 — Blood</w:t>
+      </w:r>
+    </w:p>
+    <w:p>
+      <w:r>
+        <w:t>Junqueira 17th Edition — Chapter 12</w:t>
       </w:r>
     </w:p>
     <w:p>
@@ -8411,7 +8433,7 @@
     </w:p>
     <w:p>
       <w:r>
-        <w:t>**Nucleus shape + granule color = function.**</w:t>
+        <w:t>**Leukocyte morphology reflects function, but requires integration of nucleus shape, granule content, size, and clinical context.**</w:t>
       </w:r>
     </w:p>
     <w:p>
@@ -8420,7 +8442,7 @@
           <w:b/>
           <w:i/>
         </w:rPr>
-        <w:t>**CORE IDEA:** Multilobed short-lived innate round dark long-lived adaptive kidney monocyte macrophage precursor biconcave disc no nucleus RBC gas exchange.</w:t>
+        <w:t>**CORE IDEA:** In blood, multilobed neutrophils are short-lived innate defenders, round dark small lymphocytes are long-lived adaptive cells, kidney-shaped monocytes are macrophage precursors, and biconcave discs without nuclei are red cells specialized for gas exchange.</w:t>
       </w:r>
     </w:p>
     <w:p>
@@ -9093,7 +9115,7 @@
     </w:p>
     <w:p>
       <w:r>
-        <w:t>Blood cells die days to months. Where do they come from? Next marrow factory hemopoiesis.</w:t>
+        <w:t>Blood cells die in days to months. Where do they come from? Next, the marrow factory: hemopoiesis.</w:t>
       </w:r>
     </w:p>
     <w:p>
@@ -9170,7 +9192,12 @@
         <w:pStyle w:val="Heading1"/>
       </w:pPr>
       <w:r>
-        <w:t>Chapter 11 — Hemopoiesis</w:t>
+        <w:t>Chapter 10 — Hemopoiesis</w:t>
+      </w:r>
+    </w:p>
+    <w:p>
+      <w:r>
+        <w:t>Junqueira 17th Edition — Chapter 13</w:t>
       </w:r>
     </w:p>
     <w:p>
@@ -9271,7 +9298,7 @@
           <w:b/>
           <w:i/>
         </w:rPr>
-        <w:t>**CORE IDEA:** Basophilic early RER → polychromatic mixed → eosinophilic late hemoglobin reflects protein synthesis shift.</w:t>
+        <w:t>**CORE IDEA:** In hemopoiesis, early erythroid precursors are basophilic due to abundant rough endoplasmic reticulum, intermediate forms are polychromatic as hemoglobin accumulates, and late forms are eosinophilic as hemoglobin dominates.</w:t>
       </w:r>
     </w:p>
     <w:p>
@@ -9716,7 +9743,7 @@
     </w:p>
     <w:p>
       <w:r>
-        <w:t>New lymphocytes need education before defense. Next primary vs secondary lymphoid organs and T vs B geography.</w:t>
+        <w:t>New lymphocytes need education before defense. Next, primary versus secondary lymphoid organs and T versus B geography.</w:t>
       </w:r>
     </w:p>
     <w:p>
@@ -9777,7 +9804,12 @@
         <w:pStyle w:val="Heading1"/>
       </w:pPr>
       <w:r>
-        <w:t>Chapter 12 — The Immune System &amp; Lymphoid Organs</w:t>
+        <w:t>Chapter 11 — The Immune System &amp; Lymphoid Organs</w:t>
+      </w:r>
+    </w:p>
+    <w:p>
+      <w:r>
+        <w:t>Junqueira 17th Edition — Chapter 14</w:t>
       </w:r>
     </w:p>
     <w:p>
@@ -9886,7 +9918,7 @@
           <w:b/>
           <w:i/>
         </w:rPr>
-        <w:t>**CORE IDEA:** Marrow + thymus = make them node + spleen + MALT = use them. PALS = T follicle = B.</w:t>
+        <w:t>**CORE IDEA:** Primary lymphoid organs, marrow and thymus, produce naive lymphocytes, while secondary organs, nodes, spleen, and MALT, are where lymphocytes encounter antigen. In secondary organs, the periarteriolar lymphoid sheath is T-cell rich and follicles are B-cell rich.</w:t>
       </w:r>
     </w:p>
     <w:p>
@@ -10396,7 +10428,7 @@
     </w:p>
     <w:p>
       <w:r>
-        <w:t>Defense protects gut. Gut largest interface outside world. Next how one tube digests steak absorbs fat protects from acid.</w:t>
+        <w:t>Defense protects the gut. The gut is the largest interface with the outside world. Next, how one tube digests, absorbs, and protects itself.</w:t>
       </w:r>
     </w:p>
     <w:p>
@@ -10457,7 +10489,12 @@
         <w:pStyle w:val="Heading1"/>
       </w:pPr>
       <w:r>
-        <w:t>Chapter 13 — The Digestive Tract</w:t>
+        <w:t>Chapter 12 — Digestive Tract</w:t>
+      </w:r>
+    </w:p>
+    <w:p>
+      <w:r>
+        <w:t>Junqueira 17th Edition — Chapter 15</w:t>
       </w:r>
     </w:p>
     <w:p>
@@ -10558,7 +10595,7 @@
           <w:b/>
           <w:i/>
         </w:rPr>
-        <w:t>**CORE IDEA:** Mucosa epithelium+lamina propria+muscularis mucosae submucosa Meissner muscularis externa circular+longitudinal Auerbach serosa/adventitia. Regional modifications explain function.</w:t>
+        <w:t>**CORE IDEA:** The digestive tract shares a common four-layer plan — mucosa, submucosa, muscularis externa, and serosa or adventitia — with regional modifications in epithelium, glands, villi, lymphoid tissue, and muscle that explain specialized functions.</w:t>
       </w:r>
     </w:p>
     <w:p>
@@ -11185,7 +11222,7 @@
     </w:p>
     <w:p>
       <w:r>
-        <w:t>Tube needs accessory organs to process nutrients liver pancreas salivary. Next organs associated with digestive tract.</w:t>
+        <w:t>The tube needs accessory organs to process nutrients. Next, organs associated with the digestive tract: liver, pancreas, and salivary glands.</w:t>
       </w:r>
     </w:p>
     <w:p>
@@ -11246,7 +11283,12 @@
         <w:pStyle w:val="Heading1"/>
       </w:pPr>
       <w:r>
-        <w:t>Chapter 14 — Organs Associated with the Digestive Tract</w:t>
+        <w:t>Chapter 13 — Organs Associated with the Digestive Tract</w:t>
+      </w:r>
+    </w:p>
+    <w:p>
+      <w:r>
+        <w:t>Junqueira 17th Edition — Chapter 16</w:t>
       </w:r>
     </w:p>
     <w:p>
@@ -11347,7 +11389,7 @@
           <w:b/>
           <w:i/>
         </w:rPr>
-        <w:t>**CORE IDEA:** Classic lobule central vein blood flow portal lobule bile flow acinus metabolic zones explain liver function injury pattern.</w:t>
+        <w:t>**CORE IDEA:** The liver can be described by three models: the classic lobule centered on the central vein for blood flow, the portal lobule centered on the portal triad for bile drainage, and the acinus for metabolic zonation and injury patterns.</w:t>
       </w:r>
     </w:p>
     <w:p>
@@ -12070,7 +12112,7 @@
     </w:p>
     <w:p>
       <w:r>
-        <w:t>Gut absorbs nutrients liver processes pancreas regulates glucose. Next organ exchanges gas with similar barrier logic but air respiratory.</w:t>
+        <w:t>The gut absorbs nutrients, the liver processes them, and the pancreas regulates glucose. Next, an organ that exchanges gas with a similar barrier logic but for air: the respiratory system.</w:t>
       </w:r>
     </w:p>
     <w:p>
@@ -12115,7 +12157,12 @@
         <w:pStyle w:val="Heading1"/>
       </w:pPr>
       <w:r>
-        <w:t>Chapter 15 — The Respiratory System</w:t>
+        <w:t>Chapter 14 — The Respiratory System</w:t>
+      </w:r>
+    </w:p>
+    <w:p>
+      <w:r>
+        <w:t>Junqueira 17th Edition — Chapter 17</w:t>
       </w:r>
     </w:p>
     <w:p>
@@ -12216,7 +12263,7 @@
           <w:b/>
           <w:i/>
         </w:rPr>
-        <w:t>**CORE IDEA:** Bronchus has cartilage and glands bronchiole has no cartilage no glands but has Clara cells and more smooth muscle. Blood-air barrier thin diffusion but tight protein.</w:t>
+        <w:t>**CORE IDEA:** A bronchus has cartilage plates and submucosal glands, while a bronchiole has no cartilage or glands but has club cells and relatively more smooth muscle. The blood-air barrier is thin for diffusion yet tight to prevent protein leak.</w:t>
       </w:r>
     </w:p>
     <w:p>
@@ -12962,7 +13009,7 @@
     </w:p>
     <w:p>
       <w:r>
-        <w:t>Lung exchanges gas thin barrier. Skin protects thick barrier. Next stratified squamous keratinized specialization integument.</w:t>
+        <w:t>The lung exchanges gas with a thin barrier. Skin protects with a thick barrier. Next, a stratified squamous keratinized specialization: skin.</w:t>
       </w:r>
     </w:p>
     <w:p>
@@ -13015,7 +13062,12 @@
         <w:pStyle w:val="Heading1"/>
       </w:pPr>
       <w:r>
-        <w:t>Chapter 16 — Skin (Integument)</w:t>
+        <w:t>Chapter 15 — Skin</w:t>
+      </w:r>
+    </w:p>
+    <w:p>
+      <w:r>
+        <w:t>Junqueira 17th Edition — Chapter 18</w:t>
       </w:r>
     </w:p>
     <w:p>
@@ -13116,7 +13168,7 @@
           <w:b/>
           <w:i/>
         </w:rPr>
-        <w:t>**CORE IDEA:** Basale stem hemidesmosome spinosum desmosome spines granulosum keratohyalin corneum keratin barrier. Melanocyte melanin supranuclear cap Langerhans antigen Merkel touch.</w:t>
+        <w:t>**CORE IDEA:** In skin, basal stem cells attach via hemidesmosomes, spinous cells connect via desmosomes visible as spines, granular cells contain keratohyalin, and corneum forms a keratin barrier. Melanocytes provide a supranuclear melanin cap for UV protection, Langerhans cells present antigen, and Merkel cells mediate touch.</w:t>
       </w:r>
     </w:p>
     <w:p>
@@ -13961,7 +14013,7 @@
     </w:p>
     <w:p>
       <w:r>
-        <w:t>Skin is barrier. Next organ filters blood with similar basement membrane logic but fenestrated urinary system.</w:t>
+        <w:t>Skin is the outer barrier. Next, ductless glands that command long-distance signaling via blood: endocrine glands.</w:t>
       </w:r>
     </w:p>
     <w:p>
@@ -14022,7 +14074,12 @@
         <w:pStyle w:val="Heading1"/>
       </w:pPr>
       <w:r>
-        <w:t>Chapter 18 — Endocrine Glands</w:t>
+        <w:t>Chapter 16 — Endocrine Glands</w:t>
+      </w:r>
+    </w:p>
+    <w:p>
+      <w:r>
+        <w:t>Junqueira 17th Edition — Chapter 20</w:t>
       </w:r>
     </w:p>
     <w:p>
@@ -14139,7 +14196,7 @@
           <w:b/>
           <w:i/>
         </w:rPr>
-        <w:t>**CORE IDEA:** Acidophil GH prolactin basophil B-FLAT FSH LH ACTH TSH historical modern somatotroph lactotroph corticotroph gonadotroph thyrotroph. Posterior Herring bodies ADH oxytocin stored. Thyroid colloid T3/T4 + C calcitonin. Adrenal GFR glomerulosa aldosterone fasciculata cortisol clear cells reticularis androgen medulla chromaffin catecholamines.</w:t>
+        <w:t>**CORE IDEA:** In endocrine glands, anterior pituitary acidophils produce growth hormone and prolactin, basophils produce FSH, LH, ACTH, and TSH, with modern immunohistochemistry identifying somatotrophs, lactotrophs, corticotrophs, gonadotrophs, and thyrotrophs. Posterior pituitary stores ADH and oxytocin in Herring bodies. Thyroid follicles store colloid for T3 and T4 with parafollicular C cells producing calcitonin. Adrenal cortex shows outer to inner zonation for salt, sugar, and sex steroids, and medulla contains chromaffin cells producing catecholamines.</w:t>
       </w:r>
     </w:p>
     <w:p>
@@ -15097,7 +15154,7 @@
     </w:p>
     <w:p>
       <w:r>
-        <w:t>Endocrine is command. Entire body epithelium + connective tissue + muscle + nerve organized by function supplied circulatory defended immune regulated endocrine. You now have map from methods to control.</w:t>
+        <w:t>Endocrine glands complete the body's long-distance signaling. You now have a continuous map from methods to cells to tissues to organ systems to hormonal control. The sixteen chapters read as one connected course.</w:t>
       </w:r>
     </w:p>
     <w:p>

</xml_diff>